<commit_message>
feat: implement portal-tic web interface and add documentation for cybersecurity management policies and procedures
</commit_message>
<xml_diff>
--- a/ciberseguridad/6-Control_Operaciones/Control_Operaciones_Activos.docx
+++ b/ciberseguridad/6-Control_Operaciones/Control_Operaciones_Activos.docx
@@ -626,7 +626,7 @@
                 </w:tcPr>
                 <w:p>
                   <w:r>
-                    <w:t>Matriz de Escaneo de Vulnerabilidades</w:t>
+                    <w:t>Inventario de Hardware</w:t>
                   </w:r>
                 </w:p>
               </w:tc>
@@ -662,7 +662,7 @@
                 </w:tcPr>
                 <w:p>
                   <w:r>
-                    <w:t>Listado de Activos Tecnológicos</w:t>
+                    <w:t>Inventario de Software</w:t>
                   </w:r>
                 </w:p>
               </w:tc>
@@ -698,7 +698,43 @@
                 </w:tcPr>
                 <w:p>
                   <w:r>
-                    <w:t>Acuerdos de Uso de Equipos (Móviles)</w:t>
+                    <w:t>Bitácoras de Monitoreo</w:t>
+                  </w:r>
+                </w:p>
+              </w:tc>
+            </w:tr>
+            <w:tr>
+              <w:tc>
+                <w:tcPr>
+                  <w:tcW w:type="dxa" w:w="2160"/>
+                  <w:vMerge/>
+                </w:tcPr>
+                <w:p/>
+              </w:tc>
+              <w:tc>
+                <w:tcPr>
+                  <w:tcW w:type="dxa" w:w="2160"/>
+                  <w:vMerge/>
+                </w:tcPr>
+                <w:p/>
+              </w:tc>
+              <w:tc>
+                <w:tcPr>
+                  <w:tcW w:type="dxa" w:w="720"/>
+                </w:tcPr>
+                <w:p>
+                  <w:r>
+                    <w:t>7.4</w:t>
+                  </w:r>
+                </w:p>
+              </w:tc>
+              <w:tc>
+                <w:tcPr>
+                  <w:tcW w:type="dxa" w:w="7200"/>
+                </w:tcPr>
+                <w:p>
+                  <w:r>
+                    <w:t>Registro de Actualizaciones (Parches)</w:t>
                   </w:r>
                 </w:p>
               </w:tc>
@@ -1156,7 +1192,7 @@
                 </w:tcPr>
                 <w:p>
                   <w:r>
-                    <w:t>Monitoreo mensual de servicios. Actualización constante del inventario.</w:t>
+                    <w:t>Inventarios actualizados anualmente. Parches críticos aplicados en &lt; 48 horas.</w:t>
                   </w:r>
                 </w:p>
               </w:tc>

</xml_diff>